<commit_message>
feat(word): identidad de Simuloo en el Word de la plantilla y del borrador del brief
Estilos con lima y tinta (título sobre el bloque lima, cita como nota con barra lima, filetes finos), Inter Tight y
JetBrains Mono con sustituta si faltan (fontTable.xml), cabecera con la marca y el tipo de documento y pie con
«Página X de Y». La marca va en cabecera, pie y estilos, no en el cuerpo, así que no se cuela en el texto que lee el
análisis. Idioma es/en/zh. Probado abriéndolo en Microsoft Word de verdad (plantilla y borradores en chino), en
LibreOffice y con lxml.

Co-Authored-By: Claude Sonnet 5.5 <noreply@anthropic.com>
</commit_message>
<xml_diff>
--- a/frontend/public/plantilla-brief-simuloo.docx
+++ b/frontend/public/plantilla-brief-simuloo.docx
@@ -1,6 +1,6 @@
 
 <file path=word/document.xml><?xml version="1.0" encoding="utf-8"?>
-<w:document xmlns:w="http://schemas.openxmlformats.org/wordprocessingml/2006/main">
+<w:document xmlns:w="http://schemas.openxmlformats.org/wordprocessingml/2006/main" xmlns:r="http://schemas.openxmlformats.org/officeDocument/2006/relationships">
   <w:body>
     <w:p>
       <w:pPr>
@@ -215,11 +215,210 @@
       </w:r>
     </w:p>
     <w:sectPr>
+      <w:headerReference w:type="default" r:id="rId2"/>
+      <w:footerReference w:type="default" r:id="rId3"/>
       <w:pgSz w:w="11906" w:h="16838"/>
-      <w:pgMar w:top="1417" w:right="1417" w:bottom="1417" w:left="1417" w:header="708" w:footer="708" w:gutter="0"/>
+      <w:pgMar w:top="1304" w:right="1417" w:bottom="1247" w:left="1417" w:header="624" w:footer="567" w:gutter="0"/>
     </w:sectPr>
   </w:body>
 </w:document>
+</file>
+
+<file path=word/footer1.xml><?xml version="1.0" encoding="utf-8"?>
+<w:ftr xmlns:w="http://schemas.openxmlformats.org/wordprocessingml/2006/main" xmlns:r="http://schemas.openxmlformats.org/officeDocument/2006/relationships">
+  <w:p>
+    <w:pPr>
+      <w:pBdr>
+        <w:top w:val="single" w:sz="4" w:space="6" w:color="DDDDDD"/>
+      </w:pBdr>
+      <w:tabs>
+        <w:tab w:val="right" w:pos="9072"/>
+      </w:tabs>
+      <w:spacing w:after="0"/>
+    </w:pPr>
+    <w:r>
+      <w:rPr>
+        <w:rFonts w:ascii="JetBrains Mono" w:hAnsi="JetBrains Mono" w:cs="JetBrains Mono"/>
+        <w:caps/>
+        <w:color w:val="6E6E6E"/>
+        <w:spacing w:val="20"/>
+        <w:sz w:val="16"/>
+      </w:rPr>
+      <w:t xml:space="preserve">Simuloo · Simulación de opinión pública con IA</w:t>
+    </w:r>
+    <w:r>
+      <w:tab/>
+    </w:r>
+    <w:r>
+      <w:rPr>
+        <w:rFonts w:ascii="JetBrains Mono" w:hAnsi="JetBrains Mono" w:cs="JetBrains Mono"/>
+        <w:caps/>
+        <w:color w:val="6E6E6E"/>
+        <w:spacing w:val="20"/>
+        <w:sz w:val="16"/>
+      </w:rPr>
+      <w:t xml:space="preserve">Página </w:t>
+    </w:r>
+    <w:r>
+      <w:rPr>
+        <w:rFonts w:ascii="JetBrains Mono" w:hAnsi="JetBrains Mono" w:cs="JetBrains Mono"/>
+        <w:caps/>
+        <w:color w:val="6E6E6E"/>
+        <w:spacing w:val="20"/>
+        <w:sz w:val="16"/>
+      </w:rPr>
+      <w:fldChar w:fldCharType="begin"/>
+    </w:r>
+    <w:r>
+      <w:rPr>
+        <w:rFonts w:ascii="JetBrains Mono" w:hAnsi="JetBrains Mono" w:cs="JetBrains Mono"/>
+        <w:caps/>
+        <w:color w:val="6E6E6E"/>
+        <w:spacing w:val="20"/>
+        <w:sz w:val="16"/>
+      </w:rPr>
+      <w:instrText xml:space="preserve"> PAGE </w:instrText>
+    </w:r>
+    <w:r>
+      <w:rPr>
+        <w:rFonts w:ascii="JetBrains Mono" w:hAnsi="JetBrains Mono" w:cs="JetBrains Mono"/>
+        <w:caps/>
+        <w:color w:val="6E6E6E"/>
+        <w:spacing w:val="20"/>
+        <w:sz w:val="16"/>
+      </w:rPr>
+      <w:fldChar w:fldCharType="separate"/>
+    </w:r>
+    <w:r>
+      <w:rPr>
+        <w:rFonts w:ascii="JetBrains Mono" w:hAnsi="JetBrains Mono" w:cs="JetBrains Mono"/>
+        <w:caps/>
+        <w:color w:val="6E6E6E"/>
+        <w:spacing w:val="20"/>
+        <w:sz w:val="16"/>
+      </w:rPr>
+      <w:t>1</w:t>
+    </w:r>
+    <w:r>
+      <w:rPr>
+        <w:rFonts w:ascii="JetBrains Mono" w:hAnsi="JetBrains Mono" w:cs="JetBrains Mono"/>
+        <w:caps/>
+        <w:color w:val="6E6E6E"/>
+        <w:spacing w:val="20"/>
+        <w:sz w:val="16"/>
+      </w:rPr>
+      <w:fldChar w:fldCharType="end"/>
+    </w:r>
+    <w:r>
+      <w:rPr>
+        <w:rFonts w:ascii="JetBrains Mono" w:hAnsi="JetBrains Mono" w:cs="JetBrains Mono"/>
+        <w:caps/>
+        <w:color w:val="6E6E6E"/>
+        <w:spacing w:val="20"/>
+        <w:sz w:val="16"/>
+      </w:rPr>
+      <w:t xml:space="preserve"> de </w:t>
+    </w:r>
+    <w:r>
+      <w:rPr>
+        <w:rFonts w:ascii="JetBrains Mono" w:hAnsi="JetBrains Mono" w:cs="JetBrains Mono"/>
+        <w:caps/>
+        <w:color w:val="6E6E6E"/>
+        <w:spacing w:val="20"/>
+        <w:sz w:val="16"/>
+      </w:rPr>
+      <w:fldChar w:fldCharType="begin"/>
+    </w:r>
+    <w:r>
+      <w:rPr>
+        <w:rFonts w:ascii="JetBrains Mono" w:hAnsi="JetBrains Mono" w:cs="JetBrains Mono"/>
+        <w:caps/>
+        <w:color w:val="6E6E6E"/>
+        <w:spacing w:val="20"/>
+        <w:sz w:val="16"/>
+      </w:rPr>
+      <w:instrText xml:space="preserve"> NUMPAGES </w:instrText>
+    </w:r>
+    <w:r>
+      <w:rPr>
+        <w:rFonts w:ascii="JetBrains Mono" w:hAnsi="JetBrains Mono" w:cs="JetBrains Mono"/>
+        <w:caps/>
+        <w:color w:val="6E6E6E"/>
+        <w:spacing w:val="20"/>
+        <w:sz w:val="16"/>
+      </w:rPr>
+      <w:fldChar w:fldCharType="separate"/>
+    </w:r>
+    <w:r>
+      <w:rPr>
+        <w:rFonts w:ascii="JetBrains Mono" w:hAnsi="JetBrains Mono" w:cs="JetBrains Mono"/>
+        <w:caps/>
+        <w:color w:val="6E6E6E"/>
+        <w:spacing w:val="20"/>
+        <w:sz w:val="16"/>
+      </w:rPr>
+      <w:t>1</w:t>
+    </w:r>
+    <w:r>
+      <w:rPr>
+        <w:rFonts w:ascii="JetBrains Mono" w:hAnsi="JetBrains Mono" w:cs="JetBrains Mono"/>
+        <w:caps/>
+        <w:color w:val="6E6E6E"/>
+        <w:spacing w:val="20"/>
+        <w:sz w:val="16"/>
+      </w:rPr>
+      <w:fldChar w:fldCharType="end"/>
+    </w:r>
+  </w:p>
+</w:ftr>
+</file>
+
+<file path=word/header1.xml><?xml version="1.0" encoding="utf-8"?>
+<w:hdr xmlns:w="http://schemas.openxmlformats.org/wordprocessingml/2006/main" xmlns:r="http://schemas.openxmlformats.org/officeDocument/2006/relationships">
+  <w:p>
+    <w:pPr>
+      <w:pBdr>
+        <w:bottom w:val="single" w:sz="4" w:space="6" w:color="DDDDDD"/>
+      </w:pBdr>
+      <w:tabs>
+        <w:tab w:val="right" w:pos="9072"/>
+      </w:tabs>
+      <w:spacing w:after="0"/>
+    </w:pPr>
+    <w:r>
+      <w:rPr>
+        <w:rFonts w:ascii="Inter Tight" w:hAnsi="Inter Tight" w:cs="Inter Tight"/>
+        <w:b/>
+        <w:color w:val="111111"/>
+        <w:sz w:val="32"/>
+      </w:rPr>
+      <w:t>simul</w:t>
+    </w:r>
+    <w:r>
+      <w:rPr>
+        <w:rFonts w:ascii="Inter Tight" w:hAnsi="Inter Tight" w:cs="Inter Tight"/>
+        <w:b/>
+        <w:color w:val="111111"/>
+        <w:sz w:val="32"/>
+        <w:shd w:val="clear" w:color="auto" w:fill="CCE673"/>
+      </w:rPr>
+      <w:t>oo</w:t>
+    </w:r>
+    <w:r>
+      <w:tab/>
+    </w:r>
+    <w:r>
+      <w:rPr>
+        <w:rFonts w:ascii="JetBrains Mono" w:hAnsi="JetBrains Mono" w:cs="JetBrains Mono"/>
+        <w:caps/>
+        <w:color w:val="6E6E6E"/>
+        <w:spacing w:val="20"/>
+        <w:sz w:val="16"/>
+      </w:rPr>
+      <w:t xml:space="preserve">Plantilla de brief</w:t>
+    </w:r>
+  </w:p>
+</w:hdr>
 </file>
 
 <file path=word/styles.xml><?xml version="1.0" encoding="utf-8"?>
@@ -227,14 +426,15 @@
   <w:docDefaults>
     <w:rPrDefault>
       <w:rPr>
-        <w:rFonts w:ascii="Calibri" w:hAnsi="Calibri" w:cs="Calibri" w:eastAsia="Calibri"/>
-        <w:sz w:val="22"/>
-        <w:lang w:val="es-ES"/>
+        <w:rFonts w:ascii="Inter Tight" w:hAnsi="Inter Tight" w:eastAsia="Microsoft YaHei" w:cs="Inter Tight"/>
+        <w:color w:val="2A2A2A"/>
+        <w:sz w:val="21"/>
+        <w:lang w:val="es-ES" w:eastAsia="zh-CN"/>
       </w:rPr>
     </w:rPrDefault>
     <w:pPrDefault>
       <w:pPr>
-        <w:spacing w:after="120" w:line="276" w:lineRule="auto"/>
+        <w:spacing w:after="100" w:line="264" w:lineRule="auto"/>
       </w:pPr>
     </w:pPrDefault>
   </w:docDefaults>
@@ -249,13 +449,15 @@
     <w:qFormat/>
     <w:pPr>
       <w:keepNext/>
-      <w:spacing w:before="360" w:after="160"/>
+      <w:spacing w:before="0" w:after="200"/>
       <w:outlineLvl w:val="0"/>
     </w:pPr>
     <w:rPr>
+      <w:rFonts w:ascii="Inter Tight" w:hAnsi="Inter Tight" w:cs="Inter Tight"/>
       <w:b/>
       <w:color w:val="111111"/>
-      <w:sz w:val="40"/>
+      <w:sz w:val="44"/>
+      <w:shd w:val="clear" w:color="auto" w:fill="CCE673"/>
     </w:rPr>
   </w:style>
   <w:style w:type="paragraph" w:styleId="Heading2">
@@ -265,10 +467,14 @@
     <w:qFormat/>
     <w:pPr>
       <w:keepNext/>
-      <w:spacing w:before="300" w:after="120"/>
+      <w:pBdr>
+        <w:bottom w:val="single" w:sz="4" w:space="4" w:color="DDDDDD"/>
+      </w:pBdr>
+      <w:spacing w:before="280" w:after="100"/>
       <w:outlineLvl w:val="1"/>
     </w:pPr>
     <w:rPr>
+      <w:rFonts w:ascii="Inter Tight" w:hAnsi="Inter Tight" w:cs="Inter Tight"/>
       <w:b/>
       <w:color w:val="111111"/>
       <w:sz w:val="30"/>
@@ -281,25 +487,32 @@
     <w:qFormat/>
     <w:pPr>
       <w:keepNext/>
-      <w:spacing w:before="240" w:after="100"/>
+      <w:spacing w:before="240" w:after="80"/>
       <w:outlineLvl w:val="2"/>
     </w:pPr>
     <w:rPr>
-      <w:b/>
-      <w:color w:val="111111"/>
-      <w:sz w:val="26"/>
+      <w:rFonts w:ascii="JetBrains Mono" w:hAnsi="JetBrains Mono" w:cs="JetBrains Mono"/>
+      <w:caps/>
+      <w:color w:val="6E6E6E"/>
+      <w:spacing w:val="20"/>
+      <w:sz w:val="18"/>
     </w:rPr>
   </w:style>
   <w:style w:type="paragraph" w:styleId="Quote">
     <w:name w:val="Quote"/>
     <w:basedOn w:val="Normal"/>
+    <w:next w:val="Normal"/>
     <w:qFormat/>
     <w:pPr>
-      <w:ind w:left="567"/>
+      <w:pBdr>
+        <w:left w:val="single" w:sz="36" w:space="10" w:color="CCE673"/>
+      </w:pBdr>
+      <w:shd w:val="clear" w:color="auto" w:fill="F0F8D5"/>
+      <w:spacing w:before="60" w:after="60"/>
+      <w:ind w:left="340" w:right="113"/>
     </w:pPr>
     <w:rPr>
-      <w:i/>
-      <w:color w:val="555555"/>
+      <w:color w:val="2A2A2A"/>
     </w:rPr>
   </w:style>
 </w:styles>

</xml_diff>